<commit_message>
changement de document planning
</commit_message>
<xml_diff>
--- a/Documentation/Planning 03.04.2026.docx
+++ b/Documentation/Planning 03.04.2026.docx
@@ -4,40 +4,85 @@
   <w:body>
     <w:p>
       <w:r>
-        <w:t>Planning 03/04/</w:t>
-      </w:r>
-      <w:proofErr w:type="gramStart"/>
-      <w:r>
-        <w:t>2026  (</w:t>
-      </w:r>
-      <w:proofErr w:type="gramEnd"/>
-      <w:r>
-        <w:t>4h)</w:t>
+        <w:t>Planning 03/04/2026  (4h)</w:t>
       </w:r>
     </w:p>
     <w:p>
       <w:r>
-        <w:t>Gabriel : Continuité du programme sur les interfaces, améliorations des designs</w:t>
+        <w:t xml:space="preserve">Gabriel : </w:t>
       </w:r>
     </w:p>
     <w:p>
       <w:r>
-        <w:t>Thomas : faire communiquer les deux programmes avec un serveur et un client afin de pouvoir jouer a deux</w:t>
+        <w:t>améliorations d</w:t>
+      </w:r>
+      <w:r>
+        <w:t>u design se connecter (1h)</w:t>
       </w:r>
     </w:p>
     <w:p>
       <w:r>
-        <w:t xml:space="preserve">Rafael : Mise en forme des scénarios possibles sur </w:t>
-      </w:r>
-      <w:proofErr w:type="spellStart"/>
-      <w:r>
-        <w:t>excel</w:t>
-      </w:r>
-      <w:proofErr w:type="spellEnd"/>
-      <w:r>
-        <w:t>.</w:t>
+        <w:t xml:space="preserve">améliorations du design </w:t>
+      </w:r>
+      <w:r>
+        <w:t xml:space="preserve">créer un compte </w:t>
+      </w:r>
+      <w:r>
+        <w:t>(1h)</w:t>
       </w:r>
     </w:p>
+    <w:p>
+      <w:r>
+        <w:t>création de l’interface principale (1h)</w:t>
+      </w:r>
+    </w:p>
+    <w:p>
+      <w:r>
+        <w:t>création de l’interface amis (30minute)</w:t>
+      </w:r>
+    </w:p>
+    <w:p>
+      <w:r>
+        <w:t>création de l’interface classement (30minutes)</w:t>
+      </w:r>
+    </w:p>
+    <w:p>
+      <w:r>
+        <w:t xml:space="preserve">Thomas : </w:t>
+      </w:r>
+    </w:p>
+    <w:p>
+      <w:r>
+        <w:t>Finir le jeu côté client (2h)</w:t>
+      </w:r>
+    </w:p>
+    <w:p>
+      <w:r>
+        <w:t>faire communiquer les deux programmes avec un serveur et un client afin de pouvoir jouer a deux</w:t>
+      </w:r>
+      <w:r>
+        <w:t xml:space="preserve"> (2h)</w:t>
+      </w:r>
+    </w:p>
+    <w:p>
+      <w:r>
+        <w:t xml:space="preserve">Rafael : </w:t>
+      </w:r>
+    </w:p>
+    <w:p>
+      <w:r>
+        <w:t>Mise en forme des scénarios possibles sur excel</w:t>
+      </w:r>
+      <w:r>
+        <w:t xml:space="preserve"> (1h30-2h)</w:t>
+      </w:r>
+    </w:p>
+    <w:p>
+      <w:r>
+        <w:t>Création du diagramme de séquence (1h30-2h)</w:t>
+      </w:r>
+    </w:p>
+    <w:p/>
     <w:sectPr>
       <w:pgSz w:w="11906" w:h="16838"/>
       <w:pgMar w:top="1417" w:right="1417" w:bottom="1417" w:left="1417" w:header="708" w:footer="708" w:gutter="0"/>
@@ -1284,6 +1329,23 @@
 </file>
 
 <file path=customXml/item1.xml><?xml version="1.0" encoding="utf-8"?>
+<p:properties xmlns:p="http://schemas.microsoft.com/office/2006/metadata/properties" xmlns:xsi="http://www.w3.org/2001/XMLSchema-instance" xmlns:pc="http://schemas.microsoft.com/office/infopath/2007/PartnerControls">
+  <documentManagement>
+    <_activity xmlns="25b9d25b-f3e3-4424-a4f0-1b70bb014b4c" xsi:nil="true"/>
+  </documentManagement>
+</p:properties>
+</file>
+
+<file path=customXml/item2.xml><?xml version="1.0" encoding="utf-8"?>
+<?mso-contentType ?>
+<FormTemplates xmlns="http://schemas.microsoft.com/sharepoint/v3/contenttype/forms">
+  <Display>DocumentLibraryForm</Display>
+  <Edit>DocumentLibraryForm</Edit>
+  <New>DocumentLibraryForm</New>
+</FormTemplates>
+</file>
+
+<file path=customXml/item3.xml><?xml version="1.0" encoding="utf-8"?>
 <ct:contentTypeSchema xmlns:ct="http://schemas.microsoft.com/office/2006/metadata/contentType" xmlns:ma="http://schemas.microsoft.com/office/2006/metadata/properties/metaAttributes" ct:_="" ma:_="" ma:contentTypeName="Document" ma:contentTypeID="0x010100E3DBFDA92D80EA48A7EED411DA26BC07" ma:contentTypeVersion="10" ma:contentTypeDescription="Crée un document." ma:contentTypeScope="" ma:versionID="03025e3d87020b386c40f76c97019727">
   <xsd:schema xmlns:xsd="http://www.w3.org/2001/XMLSchema" xmlns:xs="http://www.w3.org/2001/XMLSchema" xmlns:p="http://schemas.microsoft.com/office/2006/metadata/properties" xmlns:ns3="25b9d25b-f3e3-4424-a4f0-1b70bb014b4c" targetNamespace="http://schemas.microsoft.com/office/2006/metadata/properties" ma:root="true" ma:fieldsID="41a310ddefa9d24bbb525d96172fdc5e" ns3:_="">
     <xsd:import namespace="25b9d25b-f3e3-4424-a4f0-1b70bb014b4c"/>
@@ -1465,24 +1527,25 @@
 </ct:contentTypeSchema>
 </file>
 
-<file path=customXml/item2.xml><?xml version="1.0" encoding="utf-8"?>
-<?mso-contentType ?>
-<FormTemplates xmlns="http://schemas.microsoft.com/sharepoint/v3/contenttype/forms">
-  <Display>DocumentLibraryForm</Display>
-  <Edit>DocumentLibraryForm</Edit>
-  <New>DocumentLibraryForm</New>
-</FormTemplates>
+<file path=customXml/itemProps1.xml><?xml version="1.0" encoding="utf-8"?>
+<ds:datastoreItem xmlns:ds="http://schemas.openxmlformats.org/officeDocument/2006/customXml" ds:itemID="{68B670B0-289F-44C5-9A87-CE658E7EDF30}">
+  <ds:schemaRefs>
+    <ds:schemaRef ds:uri="http://schemas.microsoft.com/office/2006/metadata/properties"/>
+    <ds:schemaRef ds:uri="http://schemas.microsoft.com/office/infopath/2007/PartnerControls"/>
+    <ds:schemaRef ds:uri="25b9d25b-f3e3-4424-a4f0-1b70bb014b4c"/>
+  </ds:schemaRefs>
+</ds:datastoreItem>
 </file>
 
-<file path=customXml/item3.xml><?xml version="1.0" encoding="utf-8"?>
-<p:properties xmlns:p="http://schemas.microsoft.com/office/2006/metadata/properties" xmlns:xsi="http://www.w3.org/2001/XMLSchema-instance" xmlns:pc="http://schemas.microsoft.com/office/infopath/2007/PartnerControls">
-  <documentManagement>
-    <_activity xmlns="25b9d25b-f3e3-4424-a4f0-1b70bb014b4c" xsi:nil="true"/>
-  </documentManagement>
-</p:properties>
+<file path=customXml/itemProps2.xml><?xml version="1.0" encoding="utf-8"?>
+<ds:datastoreItem xmlns:ds="http://schemas.openxmlformats.org/officeDocument/2006/customXml" ds:itemID="{EB3A2C5B-CDFC-4BC1-AD89-B5EF06E9B060}">
+  <ds:schemaRefs>
+    <ds:schemaRef ds:uri="http://schemas.microsoft.com/sharepoint/v3/contenttype/forms"/>
+  </ds:schemaRefs>
+</ds:datastoreItem>
 </file>
 
-<file path=customXml/itemProps1.xml><?xml version="1.0" encoding="utf-8"?>
+<file path=customXml/itemProps3.xml><?xml version="1.0" encoding="utf-8"?>
 <ds:datastoreItem xmlns:ds="http://schemas.openxmlformats.org/officeDocument/2006/customXml" ds:itemID="{9998D99E-338E-4B1A-811A-A01F33394973}">
   <ds:schemaRefs>
     <ds:schemaRef ds:uri="http://schemas.microsoft.com/office/2006/metadata/contentType"/>
@@ -1498,22 +1561,4 @@
     <ds:schemaRef ds:uri="http://schemas.microsoft.com/internal/obd"/>
   </ds:schemaRefs>
 </ds:datastoreItem>
-</file>
-
-<file path=customXml/itemProps2.xml><?xml version="1.0" encoding="utf-8"?>
-<ds:datastoreItem xmlns:ds="http://schemas.openxmlformats.org/officeDocument/2006/customXml" ds:itemID="{EB3A2C5B-CDFC-4BC1-AD89-B5EF06E9B060}">
-  <ds:schemaRefs>
-    <ds:schemaRef ds:uri="http://schemas.microsoft.com/sharepoint/v3/contenttype/forms"/>
-  </ds:schemaRefs>
-</ds:datastoreItem>
-</file>
-
-<file path=customXml/itemProps3.xml><?xml version="1.0" encoding="utf-8"?>
-<ds:datastoreItem xmlns:ds="http://schemas.openxmlformats.org/officeDocument/2006/customXml" ds:itemID="{68B670B0-289F-44C5-9A87-CE658E7EDF30}">
-  <ds:schemaRefs>
-    <ds:schemaRef ds:uri="http://schemas.microsoft.com/office/2006/metadata/properties"/>
-    <ds:schemaRef ds:uri="http://schemas.microsoft.com/office/infopath/2007/PartnerControls"/>
-    <ds:schemaRef ds:uri="25b9d25b-f3e3-4424-a4f0-1b70bb014b4c"/>
-  </ds:schemaRefs>
-</ds:datastoreItem>
 </file>
</xml_diff>